<commit_message>
remove page number from chapter 3
</commit_message>
<xml_diff>
--- a/[03] บทที่ 3.docx
+++ b/[03] บทที่ 3.docx
@@ -4314,47 +4314,7 @@
           <w:cs/>
         </w:rPr>
         <w:tab/>
-        <w:t>จากการศึกษาบริบทการทำงานภายใน บริษัท โค้ด</w:t>
-      </w:r>
-      <w:proofErr w:type="spellStart"/>
-      <w:r>
-        <w:rPr>
-          <w:rFonts w:ascii="TH SarabunPSK" w:hAnsi="TH SarabunPSK" w:cs="TH SarabunPSK"/>
-          <w:sz w:val="32"/>
-          <w:szCs w:val="32"/>
-          <w:cs/>
-        </w:rPr>
-        <w:t>แล็บ</w:t>
-      </w:r>
-      <w:proofErr w:type="spellEnd"/>
-      <w:r>
-        <w:rPr>
-          <w:rFonts w:ascii="TH SarabunPSK" w:hAnsi="TH SarabunPSK" w:cs="TH SarabunPSK"/>
-          <w:sz w:val="32"/>
-          <w:szCs w:val="32"/>
-          <w:cs/>
-        </w:rPr>
-        <w:t xml:space="preserve"> </w:t>
-      </w:r>
-      <w:proofErr w:type="spellStart"/>
-      <w:r>
-        <w:rPr>
-          <w:rFonts w:ascii="TH SarabunPSK" w:hAnsi="TH SarabunPSK" w:cs="TH SarabunPSK"/>
-          <w:sz w:val="32"/>
-          <w:szCs w:val="32"/>
-          <w:cs/>
-        </w:rPr>
-        <w:t>เทค</w:t>
-      </w:r>
-      <w:proofErr w:type="spellEnd"/>
-      <w:r>
-        <w:rPr>
-          <w:rFonts w:ascii="TH SarabunPSK" w:hAnsi="TH SarabunPSK" w:cs="TH SarabunPSK"/>
-          <w:sz w:val="32"/>
-          <w:szCs w:val="32"/>
-          <w:cs/>
-        </w:rPr>
-        <w:t xml:space="preserve"> จำกัด พบว่าการบริหารจัดการงานธุรการและทรัพยากรบุคคลยังคงประสบปัญหาในบางขั้นตอน โดยเฉพาะการให้บริการข้อมูลแก่พนักงานและการสื่อสารภายในองค์กร กระบวนการส่วนใหญ่ยังต้องพึ่งพาเจ้าหน้าที่ในการตอบคำถามซ้ำๆ เกี่ยวกับระเบียบข้อบังคับ การตรวจสอบสิทธิ์วันลา หรือการขอเอกสารสำคัญทางภาษีและเงินเดือน ซึ่งทำให้เกิดความล่าช้าและเพิ่มภาระงานให้กับฝ่ายบุคคล นอกจากนี้ การนัดหมายประชุมและการแจ้งเตือนข่าวสารภายในบริษัทยังขาดเครื่องมือที่ช่วยบริหารจัดการอย่างเป็นระบบ ทำให้เกิดปัญหานัดหมายตกหล่น หรือข่าวสารประชาสัมพันธ์ส่งไปไม่ถึงกลุ่มเป้าหมายอย่างมีประสิทธิภาพ อีกทั้งการจัดเก็บเอกสารหลักฐานต่างๆ ยังกระจัดกระจาย ทำให้ยากต่อการสืบค้นและนำมาวิเคราะห์ข้อมูลเพื่อการบริหารงาน</w:t>
+        <w:t>จากการศึกษาบริบทการทำงานภายใน บริษัท โค้ดแล็บ เทค จำกัด พบว่าการบริหารจัดการงานธุรการและทรัพยากรบุคคลยังคงประสบปัญหาในบางขั้นตอน โดยเฉพาะการให้บริการข้อมูลแก่พนักงานและการสื่อสารภายในองค์กร กระบวนการส่วนใหญ่ยังต้องพึ่งพาเจ้าหน้าที่ในการตอบคำถามซ้ำๆ เกี่ยวกับระเบียบข้อบังคับ การตรวจสอบสิทธิ์วันลา หรือการขอเอกสารสำคัญทางภาษีและเงินเดือน ซึ่งทำให้เกิดความล่าช้าและเพิ่มภาระงานให้กับฝ่ายบุคคล นอกจากนี้ การนัดหมายประชุมและการแจ้งเตือนข่าวสารภายในบริษัทยังขาดเครื่องมือที่ช่วยบริหารจัดการอย่างเป็นระบบ ทำให้เกิดปัญหานัดหมายตกหล่น หรือข่าวสารประชาสัมพันธ์ส่งไปไม่ถึงกลุ่มเป้าหมายอย่างมีประสิทธิภาพ อีกทั้งการจัดเก็บเอกสารหลักฐานต่างๆ ยังกระจัดกระจาย ทำให้ยากต่อการสืบค้นและนำมาวิเคราะห์ข้อมูลเพื่อการบริหารงาน</w:t>
       </w:r>
     </w:p>
     <w:p>
@@ -4384,47 +4344,7 @@
           <w:cs/>
         </w:rPr>
         <w:tab/>
-        <w:t>ดังนั้น ทางผู้วิจัยจึงมีแนวคิดที่จะพัฒนาระบบผู้ช่วยแบบตัวแทนเชิงปัญญาประดิษฐ์สำหรับองค์กร เพื่อนำมาประยุกต์ใช้กับ บริษัท โค้ด</w:t>
-      </w:r>
-      <w:proofErr w:type="spellStart"/>
-      <w:r>
-        <w:rPr>
-          <w:rFonts w:ascii="TH SarabunPSK" w:hAnsi="TH SarabunPSK" w:cs="TH SarabunPSK"/>
-          <w:sz w:val="32"/>
-          <w:szCs w:val="32"/>
-          <w:cs/>
-        </w:rPr>
-        <w:t>แล็บ</w:t>
-      </w:r>
-      <w:proofErr w:type="spellEnd"/>
-      <w:r>
-        <w:rPr>
-          <w:rFonts w:ascii="TH SarabunPSK" w:hAnsi="TH SarabunPSK" w:cs="TH SarabunPSK"/>
-          <w:sz w:val="32"/>
-          <w:szCs w:val="32"/>
-          <w:cs/>
-        </w:rPr>
-        <w:t xml:space="preserve"> </w:t>
-      </w:r>
-      <w:proofErr w:type="spellStart"/>
-      <w:r>
-        <w:rPr>
-          <w:rFonts w:ascii="TH SarabunPSK" w:hAnsi="TH SarabunPSK" w:cs="TH SarabunPSK"/>
-          <w:sz w:val="32"/>
-          <w:szCs w:val="32"/>
-          <w:cs/>
-        </w:rPr>
-        <w:t>เทค</w:t>
-      </w:r>
-      <w:proofErr w:type="spellEnd"/>
-      <w:r>
-        <w:rPr>
-          <w:rFonts w:ascii="TH SarabunPSK" w:hAnsi="TH SarabunPSK" w:cs="TH SarabunPSK"/>
-          <w:sz w:val="32"/>
-          <w:szCs w:val="32"/>
-          <w:cs/>
-        </w:rPr>
-        <w:t xml:space="preserve"> จำกัด โดยพัฒนาบนแพลตฟอร์ม </w:t>
+        <w:t xml:space="preserve">ดังนั้น ทางผู้วิจัยจึงมีแนวคิดที่จะพัฒนาระบบผู้ช่วยแบบตัวแทนเชิงปัญญาประดิษฐ์สำหรับองค์กร เพื่อนำมาประยุกต์ใช้กับ บริษัท โค้ดแล็บ เทค จำกัด โดยพัฒนาบนแพลตฟอร์ม </w:t>
       </w:r>
       <w:r>
         <w:rPr>
@@ -5033,25 +4953,7 @@
           <w:sz w:val="32"/>
           <w:szCs w:val="32"/>
         </w:rPr>
-        <w:t xml:space="preserve">Line </w:t>
-      </w:r>
-      <w:proofErr w:type="spellStart"/>
-      <w:r>
-        <w:rPr>
-          <w:rFonts w:ascii="TH SarabunPSK" w:eastAsia="Times New Roman" w:hAnsi="TH SarabunPSK" w:cs="TH SarabunPSK"/>
-          <w:sz w:val="32"/>
-          <w:szCs w:val="32"/>
-        </w:rPr>
-        <w:t>UserID</w:t>
-      </w:r>
-      <w:proofErr w:type="spellEnd"/>
-      <w:r>
-        <w:rPr>
-          <w:rFonts w:ascii="TH SarabunPSK" w:eastAsia="Times New Roman" w:hAnsi="TH SarabunPSK" w:cs="TH SarabunPSK"/>
-          <w:sz w:val="32"/>
-          <w:szCs w:val="32"/>
-        </w:rPr>
-        <w:t xml:space="preserve">) </w:t>
+        <w:t xml:space="preserve">Line UserID) </w:t>
       </w:r>
       <w:r>
         <w:rPr>
@@ -6883,23 +6785,13 @@
         </w:rPr>
         <w:t>สามารถเข้าถึงและดาวน์โหลดเอกสารสรุปการจ่ายเงินเดือน (</w:t>
       </w:r>
-      <w:proofErr w:type="spellStart"/>
       <w:r>
         <w:rPr>
           <w:rFonts w:ascii="TH SarabunPSK" w:eastAsia="Times New Roman" w:hAnsi="TH SarabunPSK" w:cs="TH SarabunPSK"/>
           <w:sz w:val="32"/>
           <w:szCs w:val="32"/>
         </w:rPr>
-        <w:t>Payslip</w:t>
-      </w:r>
-      <w:proofErr w:type="spellEnd"/>
-      <w:r>
-        <w:rPr>
-          <w:rFonts w:ascii="TH SarabunPSK" w:eastAsia="Times New Roman" w:hAnsi="TH SarabunPSK" w:cs="TH SarabunPSK"/>
-          <w:sz w:val="32"/>
-          <w:szCs w:val="32"/>
-        </w:rPr>
-        <w:t xml:space="preserve">) </w:t>
+        <w:t xml:space="preserve">Payslip) </w:t>
       </w:r>
       <w:r>
         <w:rPr>
@@ -7744,23 +7636,13 @@
         </w:rPr>
         <w:t>สามารถบริหารจัดการและนำเข้าข้อมูลเอกสารสรุปการจ่ายเงินเดือน (</w:t>
       </w:r>
-      <w:proofErr w:type="spellStart"/>
       <w:r>
         <w:rPr>
           <w:rFonts w:ascii="TH SarabunPSK" w:eastAsia="Times New Roman" w:hAnsi="TH SarabunPSK" w:cs="TH SarabunPSK"/>
           <w:sz w:val="32"/>
           <w:szCs w:val="32"/>
         </w:rPr>
-        <w:t>Payslip</w:t>
-      </w:r>
-      <w:proofErr w:type="spellEnd"/>
-      <w:r>
-        <w:rPr>
-          <w:rFonts w:ascii="TH SarabunPSK" w:eastAsia="Times New Roman" w:hAnsi="TH SarabunPSK" w:cs="TH SarabunPSK"/>
-          <w:sz w:val="32"/>
-          <w:szCs w:val="32"/>
-        </w:rPr>
-        <w:t xml:space="preserve">) </w:t>
+        <w:t xml:space="preserve">Payslip) </w:t>
       </w:r>
       <w:r>
         <w:rPr>
@@ -9774,25 +9656,14 @@
         </w:rPr>
         <w:t>**</w:t>
       </w:r>
-      <w:proofErr w:type="spellStart"/>
-      <w:r>
-        <w:rPr>
-          <w:rFonts w:ascii="TH SarabunPSK" w:hAnsi="TH SarabunPSK" w:cs="TH SarabunPSK"/>
-          <w:sz w:val="32"/>
-          <w:szCs w:val="32"/>
-          <w:cs/>
-        </w:rPr>
-        <w:t>เบ</w:t>
-      </w:r>
-      <w:proofErr w:type="spellEnd"/>
-      <w:r>
-        <w:rPr>
-          <w:rFonts w:ascii="TH SarabunPSK" w:hAnsi="TH SarabunPSK" w:cs="TH SarabunPSK"/>
-          <w:sz w:val="32"/>
-          <w:szCs w:val="32"/>
-          <w:cs/>
-        </w:rPr>
-        <w:t xml:space="preserve">ราว์เซอร์ทดสอบ: </w:t>
+      <w:r>
+        <w:rPr>
+          <w:rFonts w:ascii="TH SarabunPSK" w:hAnsi="TH SarabunPSK" w:cs="TH SarabunPSK"/>
+          <w:sz w:val="32"/>
+          <w:szCs w:val="32"/>
+          <w:cs/>
+        </w:rPr>
+        <w:t xml:space="preserve">เบราว์เซอร์ทดสอบ: </w:t>
       </w:r>
       <w:r>
         <w:rPr>
@@ -9836,25 +9707,14 @@
         </w:rPr>
         <w:t>Firefox (</w:t>
       </w:r>
-      <w:proofErr w:type="spellStart"/>
-      <w:r>
-        <w:rPr>
-          <w:rFonts w:ascii="TH SarabunPSK" w:hAnsi="TH SarabunPSK" w:cs="TH SarabunPSK"/>
-          <w:sz w:val="32"/>
-          <w:szCs w:val="32"/>
-          <w:cs/>
-        </w:rPr>
-        <w:t>เวอร์ชัน</w:t>
-      </w:r>
-      <w:proofErr w:type="spellEnd"/>
-      <w:r>
-        <w:rPr>
-          <w:rFonts w:ascii="TH SarabunPSK" w:hAnsi="TH SarabunPSK" w:cs="TH SarabunPSK"/>
-          <w:sz w:val="32"/>
-          <w:szCs w:val="32"/>
-          <w:cs/>
-        </w:rPr>
-        <w:t>ล่าสุด)</w:t>
+      <w:r>
+        <w:rPr>
+          <w:rFonts w:ascii="TH SarabunPSK" w:hAnsi="TH SarabunPSK" w:cs="TH SarabunPSK"/>
+          <w:sz w:val="32"/>
+          <w:szCs w:val="32"/>
+          <w:cs/>
+        </w:rPr>
+        <w:t>เวอร์ชันล่าสุด)</w:t>
       </w:r>
     </w:p>
     <w:p>
@@ -10097,51 +9957,15 @@
           <w:sz w:val="32"/>
           <w:szCs w:val="32"/>
         </w:rPr>
-        <w:t xml:space="preserve">Google </w:t>
-      </w:r>
-      <w:proofErr w:type="gramStart"/>
-      <w:r>
-        <w:rPr>
-          <w:rFonts w:ascii="TH SarabunPSK" w:hAnsi="TH SarabunPSK" w:cs="TH SarabunPSK"/>
-          <w:sz w:val="32"/>
-          <w:szCs w:val="32"/>
-        </w:rPr>
-        <w:t>API ,</w:t>
-      </w:r>
-      <w:proofErr w:type="gramEnd"/>
-      <w:r>
-        <w:rPr>
-          <w:rFonts w:ascii="TH SarabunPSK" w:hAnsi="TH SarabunPSK" w:cs="TH SarabunPSK"/>
-          <w:sz w:val="32"/>
-          <w:szCs w:val="32"/>
-        </w:rPr>
-        <w:t xml:space="preserve"> Google Sheets, Go</w:t>
-      </w:r>
-      <w:r>
-        <w:rPr>
-          <w:rFonts w:ascii="TH SarabunPSK" w:hAnsi="TH SarabunPSK" w:cs="TH SarabunPSK"/>
-          <w:sz w:val="32"/>
-          <w:szCs w:val="32"/>
-        </w:rPr>
-        <w:t xml:space="preserve">ogle Drive, </w:t>
-      </w:r>
-      <w:proofErr w:type="spellStart"/>
-      <w:r>
-        <w:rPr>
-          <w:rFonts w:ascii="TH SarabunPSK" w:hAnsi="TH SarabunPSK" w:cs="TH SarabunPSK"/>
-          <w:sz w:val="32"/>
-          <w:szCs w:val="32"/>
-        </w:rPr>
-        <w:t>OpenAI</w:t>
-      </w:r>
-      <w:proofErr w:type="spellEnd"/>
-      <w:r>
-        <w:rPr>
-          <w:rFonts w:ascii="TH SarabunPSK" w:hAnsi="TH SarabunPSK" w:cs="TH SarabunPSK"/>
-          <w:sz w:val="32"/>
-          <w:szCs w:val="32"/>
-        </w:rPr>
-        <w:t xml:space="preserve"> </w:t>
+        <w:t>Google API , Google Sheets, Go</w:t>
+      </w:r>
+      <w:r>
+        <w:rPr>
+          <w:rFonts w:ascii="TH SarabunPSK" w:hAnsi="TH SarabunPSK" w:cs="TH SarabunPSK"/>
+          <w:sz w:val="32"/>
+          <w:szCs w:val="32"/>
+        </w:rPr>
+        <w:t xml:space="preserve">ogle Drive, OpenAI </w:t>
       </w:r>
     </w:p>
     <w:p>
@@ -11359,25 +11183,14 @@
         </w:rPr>
         <w:t>ล</w:t>
       </w:r>
-      <w:proofErr w:type="spellStart"/>
-      <w:r>
-        <w:rPr>
-          <w:rFonts w:ascii="TH SarabunPSK" w:hAnsi="TH SarabunPSK" w:cs="TH SarabunPSK"/>
-          <w:sz w:val="32"/>
-          <w:szCs w:val="32"/>
-          <w:cs/>
-        </w:rPr>
-        <w:t>งเว</w:t>
-      </w:r>
-      <w:proofErr w:type="spellEnd"/>
-      <w:r>
-        <w:rPr>
-          <w:rFonts w:ascii="TH SarabunPSK" w:hAnsi="TH SarabunPSK" w:cs="TH SarabunPSK"/>
-          <w:sz w:val="32"/>
-          <w:szCs w:val="32"/>
-          <w:cs/>
-        </w:rPr>
-        <w:t>ลา</w:t>
+      <w:r>
+        <w:rPr>
+          <w:rFonts w:ascii="TH SarabunPSK" w:hAnsi="TH SarabunPSK" w:cs="TH SarabunPSK"/>
+          <w:sz w:val="32"/>
+          <w:szCs w:val="32"/>
+          <w:cs/>
+        </w:rPr>
+        <w:t>งเวลา</w:t>
       </w:r>
       <w:r>
         <w:rPr>
@@ -12254,27 +12067,7 @@
           <w:szCs w:val="32"/>
           <w:cs/>
         </w:rPr>
-        <w:t>ระบบตรวจสอบส</w:t>
-      </w:r>
-      <w:proofErr w:type="spellStart"/>
-      <w:r>
-        <w:rPr>
-          <w:rFonts w:ascii="TH SarabunPSK" w:hAnsi="TH SarabunPSK" w:cs="TH SarabunPSK" w:hint="cs"/>
-          <w:sz w:val="32"/>
-          <w:szCs w:val="32"/>
-          <w:cs/>
-        </w:rPr>
-        <w:t>ลิป</w:t>
-      </w:r>
-      <w:proofErr w:type="spellEnd"/>
-      <w:r>
-        <w:rPr>
-          <w:rFonts w:ascii="TH SarabunPSK" w:hAnsi="TH SarabunPSK" w:cs="TH SarabunPSK" w:hint="cs"/>
-          <w:sz w:val="32"/>
-          <w:szCs w:val="32"/>
-          <w:cs/>
-        </w:rPr>
-        <w:t xml:space="preserve"> และเก็บลงโฟลเดอร์</w:t>
+        <w:t>ระบบตรวจสอบสลิป และเก็บลงโฟลเดอร์</w:t>
       </w:r>
       <w:r>
         <w:rPr>
@@ -14288,25 +14081,14 @@
         </w:rPr>
         <w:t>ล</w:t>
       </w:r>
-      <w:proofErr w:type="spellStart"/>
-      <w:r>
-        <w:rPr>
-          <w:rFonts w:ascii="TH SarabunPSK" w:hAnsi="TH SarabunPSK" w:cs="TH SarabunPSK"/>
-          <w:sz w:val="32"/>
-          <w:szCs w:val="32"/>
-          <w:cs/>
-        </w:rPr>
-        <w:t>งเว</w:t>
-      </w:r>
-      <w:proofErr w:type="spellEnd"/>
-      <w:r>
-        <w:rPr>
-          <w:rFonts w:ascii="TH SarabunPSK" w:hAnsi="TH SarabunPSK" w:cs="TH SarabunPSK"/>
-          <w:sz w:val="32"/>
-          <w:szCs w:val="32"/>
-          <w:cs/>
-        </w:rPr>
-        <w:t>ลา เข้า</w:t>
+      <w:r>
+        <w:rPr>
+          <w:rFonts w:ascii="TH SarabunPSK" w:hAnsi="TH SarabunPSK" w:cs="TH SarabunPSK"/>
+          <w:sz w:val="32"/>
+          <w:szCs w:val="32"/>
+          <w:cs/>
+        </w:rPr>
+        <w:t>งเวลา เข้า</w:t>
       </w:r>
       <w:r>
         <w:rPr>
@@ -15136,25 +14918,14 @@
         </w:rPr>
         <w:t>ล</w:t>
       </w:r>
-      <w:proofErr w:type="spellStart"/>
-      <w:r>
-        <w:rPr>
-          <w:rFonts w:ascii="TH SarabunPSK" w:hAnsi="TH SarabunPSK" w:cs="TH SarabunPSK"/>
-          <w:sz w:val="32"/>
-          <w:szCs w:val="32"/>
-          <w:cs/>
-        </w:rPr>
-        <w:t>งเว</w:t>
-      </w:r>
-      <w:proofErr w:type="spellEnd"/>
-      <w:r>
-        <w:rPr>
-          <w:rFonts w:ascii="TH SarabunPSK" w:hAnsi="TH SarabunPSK" w:cs="TH SarabunPSK"/>
-          <w:sz w:val="32"/>
-          <w:szCs w:val="32"/>
-          <w:cs/>
-        </w:rPr>
-        <w:t>ลา เข้า</w:t>
+      <w:r>
+        <w:rPr>
+          <w:rFonts w:ascii="TH SarabunPSK" w:hAnsi="TH SarabunPSK" w:cs="TH SarabunPSK"/>
+          <w:sz w:val="32"/>
+          <w:szCs w:val="32"/>
+          <w:cs/>
+        </w:rPr>
+        <w:t>งเวลา เข้า</w:t>
       </w:r>
       <w:r>
         <w:rPr>
@@ -20173,27 +19944,7 @@
           <w:szCs w:val="32"/>
           <w:cs/>
         </w:rPr>
-        <w:t>ระบบเช็คส</w:t>
-      </w:r>
-      <w:proofErr w:type="spellStart"/>
-      <w:r>
-        <w:rPr>
-          <w:rFonts w:ascii="TH SarabunPSK" w:hAnsi="TH SarabunPSK" w:cs="TH SarabunPSK" w:hint="cs"/>
-          <w:sz w:val="32"/>
-          <w:szCs w:val="32"/>
-          <w:cs/>
-        </w:rPr>
-        <w:t>ลิป</w:t>
-      </w:r>
-      <w:proofErr w:type="spellEnd"/>
-      <w:r>
-        <w:rPr>
-          <w:rFonts w:ascii="TH SarabunPSK" w:hAnsi="TH SarabunPSK" w:cs="TH SarabunPSK" w:hint="cs"/>
-          <w:sz w:val="32"/>
-          <w:szCs w:val="32"/>
-          <w:cs/>
-        </w:rPr>
-        <w:t xml:space="preserve">และเก็บลงโฟลเดอร์ </w:t>
+        <w:t xml:space="preserve">ระบบเช็คสลิปและเก็บลงโฟลเดอร์ </w:t>
       </w:r>
       <w:r>
         <w:rPr>
@@ -20281,27 +20032,7 @@
           <w:szCs w:val="32"/>
           <w:cs/>
         </w:rPr>
-        <w:t>ระบบเช็คส</w:t>
-      </w:r>
-      <w:proofErr w:type="spellStart"/>
-      <w:r>
-        <w:rPr>
-          <w:rFonts w:ascii="TH SarabunPSK" w:hAnsi="TH SarabunPSK" w:cs="TH SarabunPSK" w:hint="cs"/>
-          <w:sz w:val="32"/>
-          <w:szCs w:val="32"/>
-          <w:cs/>
-        </w:rPr>
-        <w:t>ลิป</w:t>
-      </w:r>
-      <w:proofErr w:type="spellEnd"/>
-      <w:r>
-        <w:rPr>
-          <w:rFonts w:ascii="TH SarabunPSK" w:hAnsi="TH SarabunPSK" w:cs="TH SarabunPSK" w:hint="cs"/>
-          <w:sz w:val="32"/>
-          <w:szCs w:val="32"/>
-          <w:cs/>
-        </w:rPr>
-        <w:t xml:space="preserve">และเก็บลงโฟลเดอร์ </w:t>
+        <w:t xml:space="preserve">ระบบเช็คสลิปและเก็บลงโฟลเดอร์ </w:t>
       </w:r>
       <w:r>
         <w:rPr>
@@ -20481,9 +20212,16 @@
           <w:szCs w:val="32"/>
           <w:cs/>
         </w:rPr>
-        <w:t>รูปภาพส</w:t>
-      </w:r>
-      <w:proofErr w:type="spellStart"/>
+        <w:t>รูปภาพสลิป</w:t>
+      </w:r>
+      <w:r>
+        <w:rPr>
+          <w:rFonts w:ascii="TH SarabunPSK" w:hAnsi="TH SarabunPSK" w:cs="TH SarabunPSK"/>
+          <w:sz w:val="32"/>
+          <w:szCs w:val="32"/>
+        </w:rPr>
+        <w:t xml:space="preserve"> /</w:t>
+      </w:r>
       <w:r>
         <w:rPr>
           <w:rFonts w:ascii="TH SarabunPSK" w:hAnsi="TH SarabunPSK" w:cs="TH SarabunPSK" w:hint="cs"/>
@@ -20491,37 +20229,8 @@
           <w:szCs w:val="32"/>
           <w:cs/>
         </w:rPr>
-        <w:t>ลิป</w:t>
-      </w:r>
-      <w:proofErr w:type="spellEnd"/>
-      <w:r>
-        <w:rPr>
-          <w:rFonts w:ascii="TH SarabunPSK" w:hAnsi="TH SarabunPSK" w:cs="TH SarabunPSK"/>
-          <w:sz w:val="32"/>
-          <w:szCs w:val="32"/>
-        </w:rPr>
-        <w:t xml:space="preserve"> /</w:t>
-      </w:r>
-      <w:r>
-        <w:rPr>
-          <w:rFonts w:ascii="TH SarabunPSK" w:hAnsi="TH SarabunPSK" w:cs="TH SarabunPSK" w:hint="cs"/>
-          <w:sz w:val="32"/>
-          <w:szCs w:val="32"/>
-          <w:cs/>
-        </w:rPr>
-        <w:t xml:space="preserve"> ไม่ใช่รูปภาพส</w:t>
-      </w:r>
-      <w:proofErr w:type="spellStart"/>
-      <w:r>
-        <w:rPr>
-          <w:rFonts w:ascii="TH SarabunPSK" w:hAnsi="TH SarabunPSK" w:cs="TH SarabunPSK" w:hint="cs"/>
-          <w:sz w:val="32"/>
-          <w:szCs w:val="32"/>
-          <w:cs/>
-        </w:rPr>
-        <w:t>ลิป</w:t>
-      </w:r>
-      <w:proofErr w:type="spellEnd"/>
+        <w:t xml:space="preserve"> ไม่ใช่รูปภาพสลิป</w:t>
+      </w:r>
     </w:p>
     <w:p>
       <w:pPr>
@@ -20905,27 +20614,7 @@
           <w:szCs w:val="32"/>
           <w:cs/>
         </w:rPr>
-        <w:t>เช็คส</w:t>
-      </w:r>
-      <w:proofErr w:type="spellStart"/>
-      <w:r>
-        <w:rPr>
-          <w:rFonts w:ascii="TH SarabunPSK" w:hAnsi="TH SarabunPSK" w:cs="TH SarabunPSK" w:hint="cs"/>
-          <w:sz w:val="32"/>
-          <w:szCs w:val="32"/>
-          <w:cs/>
-        </w:rPr>
-        <w:t>ลิป</w:t>
-      </w:r>
-      <w:proofErr w:type="spellEnd"/>
-      <w:r>
-        <w:rPr>
-          <w:rFonts w:ascii="TH SarabunPSK" w:hAnsi="TH SarabunPSK" w:cs="TH SarabunPSK" w:hint="cs"/>
-          <w:sz w:val="32"/>
-          <w:szCs w:val="32"/>
-          <w:cs/>
-        </w:rPr>
-        <w:t xml:space="preserve">และเก็บลงโฟลเดอร์ </w:t>
+        <w:t xml:space="preserve">เช็คสลิปและเก็บลงโฟลเดอร์ </w:t>
       </w:r>
       <w:r>
         <w:rPr>
@@ -21998,19 +21687,8 @@
           <w:szCs w:val="32"/>
           <w:cs/>
         </w:rPr>
-        <w:t>และรี</w:t>
-      </w:r>
-      <w:proofErr w:type="spellStart"/>
-      <w:r>
-        <w:rPr>
-          <w:rFonts w:ascii="TH SarabunPSK" w:hAnsi="TH SarabunPSK" w:cs="TH SarabunPSK"/>
-          <w:sz w:val="32"/>
-          <w:szCs w:val="32"/>
-          <w:cs/>
-        </w:rPr>
-        <w:t>เลชั่น</w:t>
-      </w:r>
-      <w:proofErr w:type="spellEnd"/>
+        <w:t>และรีเลชั่น</w:t>
+      </w:r>
     </w:p>
     <w:p>
       <w:pPr>
@@ -22155,27 +21833,7 @@
                 <w:szCs w:val="32"/>
                 <w:cs/>
               </w:rPr>
-              <w:t>ชื่อ</w:t>
-            </w:r>
-            <w:proofErr w:type="spellStart"/>
-            <w:r>
-              <w:rPr>
-                <w:rFonts w:ascii="TH SarabunPSK" w:hAnsi="TH SarabunPSK" w:cs="TH SarabunPSK"/>
-                <w:sz w:val="32"/>
-                <w:szCs w:val="32"/>
-                <w:cs/>
-              </w:rPr>
-              <w:t>ฟิ</w:t>
-            </w:r>
-            <w:proofErr w:type="spellEnd"/>
-            <w:r>
-              <w:rPr>
-                <w:rFonts w:ascii="TH SarabunPSK" w:hAnsi="TH SarabunPSK" w:cs="TH SarabunPSK"/>
-                <w:sz w:val="32"/>
-                <w:szCs w:val="32"/>
-                <w:cs/>
-              </w:rPr>
-              <w:t>ลด์</w:t>
+              <w:t>ชื่อฟิลด์</w:t>
             </w:r>
           </w:p>
         </w:tc>
@@ -22491,7 +22149,6 @@
                 <w:szCs w:val="32"/>
               </w:rPr>
             </w:pPr>
-            <w:proofErr w:type="spellStart"/>
             <w:r>
               <w:rPr>
                 <w:rFonts w:ascii="TH SarabunPSK" w:hAnsi="TH SarabunPSK" w:cs="TH SarabunPSK"/>
@@ -22500,7 +22157,6 @@
               </w:rPr>
               <w:t>fname</w:t>
             </w:r>
-            <w:proofErr w:type="spellEnd"/>
           </w:p>
         </w:tc>
         <w:tc>
@@ -22658,7 +22314,6 @@
                 <w:szCs w:val="32"/>
               </w:rPr>
             </w:pPr>
-            <w:proofErr w:type="spellStart"/>
             <w:r>
               <w:rPr>
                 <w:rFonts w:ascii="TH SarabunPSK" w:hAnsi="TH SarabunPSK" w:cs="TH SarabunPSK"/>
@@ -22667,7 +22322,6 @@
               </w:rPr>
               <w:t>nname</w:t>
             </w:r>
-            <w:proofErr w:type="spellEnd"/>
           </w:p>
         </w:tc>
         <w:tc>
@@ -22808,7 +22462,6 @@
                 <w:szCs w:val="32"/>
               </w:rPr>
             </w:pPr>
-            <w:proofErr w:type="spellStart"/>
             <w:r>
               <w:rPr>
                 <w:rFonts w:ascii="TH SarabunPSK" w:hAnsi="TH SarabunPSK" w:cs="TH SarabunPSK"/>
@@ -22817,7 +22470,6 @@
               </w:rPr>
               <w:t>Uline_id</w:t>
             </w:r>
-            <w:proofErr w:type="spellEnd"/>
           </w:p>
         </w:tc>
         <w:tc>
@@ -23811,7 +23463,6 @@
         </w:rPr>
         <w:t>o</w:t>
       </w:r>
-      <w:proofErr w:type="spellStart"/>
       <w:r>
         <w:rPr>
           <w:rFonts w:ascii="TH SarabunPSK" w:hAnsi="TH SarabunPSK" w:cs="TH SarabunPSK"/>
@@ -23820,7 +23471,6 @@
         </w:rPr>
         <w:t>sition</w:t>
       </w:r>
-      <w:proofErr w:type="spellEnd"/>
       <w:r>
         <w:rPr>
           <w:rFonts w:ascii="TH SarabunPSK" w:hAnsi="TH SarabunPSK" w:cs="TH SarabunPSK"/>
@@ -23873,27 +23523,7 @@
                 <w:szCs w:val="32"/>
                 <w:cs/>
               </w:rPr>
-              <w:t>ชื่อ</w:t>
-            </w:r>
-            <w:proofErr w:type="spellStart"/>
-            <w:r>
-              <w:rPr>
-                <w:rFonts w:ascii="TH SarabunPSK" w:hAnsi="TH SarabunPSK" w:cs="TH SarabunPSK"/>
-                <w:sz w:val="32"/>
-                <w:szCs w:val="32"/>
-                <w:cs/>
-              </w:rPr>
-              <w:t>ฟิ</w:t>
-            </w:r>
-            <w:proofErr w:type="spellEnd"/>
-            <w:r>
-              <w:rPr>
-                <w:rFonts w:ascii="TH SarabunPSK" w:hAnsi="TH SarabunPSK" w:cs="TH SarabunPSK"/>
-                <w:sz w:val="32"/>
-                <w:szCs w:val="32"/>
-                <w:cs/>
-              </w:rPr>
-              <w:t>ลด์</w:t>
+              <w:t>ชื่อฟิลด์</w:t>
             </w:r>
           </w:p>
         </w:tc>
@@ -24053,7 +23683,6 @@
                 <w:szCs w:val="32"/>
               </w:rPr>
             </w:pPr>
-            <w:proofErr w:type="spellStart"/>
             <w:r>
               <w:rPr>
                 <w:rFonts w:ascii="TH SarabunPSK" w:hAnsi="TH SarabunPSK" w:cs="TH SarabunPSK"/>
@@ -24062,7 +23691,6 @@
               </w:rPr>
               <w:t>P_id</w:t>
             </w:r>
-            <w:proofErr w:type="spellEnd"/>
           </w:p>
         </w:tc>
         <w:tc>
@@ -24212,7 +23840,6 @@
                 <w:szCs w:val="32"/>
               </w:rPr>
             </w:pPr>
-            <w:proofErr w:type="spellStart"/>
             <w:r>
               <w:rPr>
                 <w:rFonts w:ascii="TH SarabunPSK" w:hAnsi="TH SarabunPSK" w:cs="TH SarabunPSK"/>
@@ -24221,7 +23848,6 @@
               </w:rPr>
               <w:t>P_name</w:t>
             </w:r>
-            <w:proofErr w:type="spellEnd"/>
           </w:p>
         </w:tc>
         <w:tc>
@@ -24523,27 +24149,7 @@
                 <w:szCs w:val="32"/>
                 <w:cs/>
               </w:rPr>
-              <w:t>ชื่อ</w:t>
-            </w:r>
-            <w:proofErr w:type="spellStart"/>
-            <w:r>
-              <w:rPr>
-                <w:rFonts w:ascii="TH SarabunPSK" w:hAnsi="TH SarabunPSK" w:cs="TH SarabunPSK"/>
-                <w:sz w:val="32"/>
-                <w:szCs w:val="32"/>
-                <w:cs/>
-              </w:rPr>
-              <w:t>ฟิ</w:t>
-            </w:r>
-            <w:proofErr w:type="spellEnd"/>
-            <w:r>
-              <w:rPr>
-                <w:rFonts w:ascii="TH SarabunPSK" w:hAnsi="TH SarabunPSK" w:cs="TH SarabunPSK"/>
-                <w:sz w:val="32"/>
-                <w:szCs w:val="32"/>
-                <w:cs/>
-              </w:rPr>
-              <w:t>ลด์</w:t>
+              <w:t>ชื่อฟิลด์</w:t>
             </w:r>
           </w:p>
         </w:tc>
@@ -24703,7 +24309,6 @@
                 <w:szCs w:val="32"/>
               </w:rPr>
             </w:pPr>
-            <w:proofErr w:type="spellStart"/>
             <w:r>
               <w:rPr>
                 <w:rFonts w:ascii="TH SarabunPSK" w:hAnsi="TH SarabunPSK" w:cs="TH SarabunPSK"/>
@@ -24712,7 +24317,6 @@
               </w:rPr>
               <w:t>Dep_id</w:t>
             </w:r>
-            <w:proofErr w:type="spellEnd"/>
           </w:p>
         </w:tc>
         <w:tc>
@@ -24862,7 +24466,6 @@
                 <w:szCs w:val="32"/>
               </w:rPr>
             </w:pPr>
-            <w:proofErr w:type="spellStart"/>
             <w:r>
               <w:rPr>
                 <w:rFonts w:ascii="TH SarabunPSK" w:hAnsi="TH SarabunPSK" w:cs="TH SarabunPSK"/>
@@ -24871,7 +24474,6 @@
               </w:rPr>
               <w:t>Dep_name</w:t>
             </w:r>
-            <w:proofErr w:type="spellEnd"/>
           </w:p>
         </w:tc>
         <w:tc>
@@ -25086,27 +24688,7 @@
           <w:szCs w:val="32"/>
           <w:cs/>
         </w:rPr>
-        <w:t>ตารางความ</w:t>
-      </w:r>
-      <w:proofErr w:type="spellStart"/>
-      <w:r>
-        <w:rPr>
-          <w:rFonts w:ascii="TH SarabunPSK" w:hAnsi="TH SarabunPSK" w:cs="TH SarabunPSK"/>
-          <w:sz w:val="32"/>
-          <w:szCs w:val="32"/>
-          <w:cs/>
-        </w:rPr>
-        <w:t>สัม</w:t>
-      </w:r>
-      <w:proofErr w:type="spellEnd"/>
-      <w:r>
-        <w:rPr>
-          <w:rFonts w:ascii="TH SarabunPSK" w:hAnsi="TH SarabunPSK" w:cs="TH SarabunPSK"/>
-          <w:sz w:val="32"/>
-          <w:szCs w:val="32"/>
-          <w:cs/>
-        </w:rPr>
-        <w:t>พันธุ์</w:t>
+        <w:t>ตารางความสัมพันธุ์</w:t>
       </w:r>
       <w:r>
         <w:rPr>
@@ -25125,7 +24707,6 @@
         </w:rPr>
         <w:t>(</w:t>
       </w:r>
-      <w:proofErr w:type="spellStart"/>
       <w:r>
         <w:rPr>
           <w:rFonts w:ascii="TH SarabunPSK" w:hAnsi="TH SarabunPSK" w:cs="TH SarabunPSK"/>
@@ -25134,7 +24715,6 @@
         </w:rPr>
         <w:t>dep_pos</w:t>
       </w:r>
-      <w:proofErr w:type="spellEnd"/>
       <w:r>
         <w:rPr>
           <w:rFonts w:ascii="TH SarabunPSK" w:hAnsi="TH SarabunPSK" w:cs="TH SarabunPSK"/>
@@ -25187,27 +24767,7 @@
                 <w:szCs w:val="32"/>
                 <w:cs/>
               </w:rPr>
-              <w:t>ชื่อ</w:t>
-            </w:r>
-            <w:proofErr w:type="spellStart"/>
-            <w:r>
-              <w:rPr>
-                <w:rFonts w:ascii="TH SarabunPSK" w:hAnsi="TH SarabunPSK" w:cs="TH SarabunPSK"/>
-                <w:sz w:val="32"/>
-                <w:szCs w:val="32"/>
-                <w:cs/>
-              </w:rPr>
-              <w:t>ฟิ</w:t>
-            </w:r>
-            <w:proofErr w:type="spellEnd"/>
-            <w:r>
-              <w:rPr>
-                <w:rFonts w:ascii="TH SarabunPSK" w:hAnsi="TH SarabunPSK" w:cs="TH SarabunPSK"/>
-                <w:sz w:val="32"/>
-                <w:szCs w:val="32"/>
-                <w:cs/>
-              </w:rPr>
-              <w:t>ลด์</w:t>
+              <w:t>ชื่อฟิลด์</w:t>
             </w:r>
           </w:p>
         </w:tc>
@@ -25367,7 +24927,6 @@
                 <w:szCs w:val="32"/>
               </w:rPr>
             </w:pPr>
-            <w:proofErr w:type="spellStart"/>
             <w:r>
               <w:rPr>
                 <w:rFonts w:ascii="TH SarabunPSK" w:hAnsi="TH SarabunPSK" w:cs="TH SarabunPSK"/>
@@ -25376,7 +24935,6 @@
               </w:rPr>
               <w:t>Dp_id</w:t>
             </w:r>
-            <w:proofErr w:type="spellEnd"/>
           </w:p>
         </w:tc>
         <w:tc>
@@ -25525,7 +25083,6 @@
                 <w:szCs w:val="32"/>
               </w:rPr>
             </w:pPr>
-            <w:proofErr w:type="spellStart"/>
             <w:r>
               <w:rPr>
                 <w:rFonts w:ascii="TH SarabunPSK" w:hAnsi="TH SarabunPSK" w:cs="TH SarabunPSK"/>
@@ -25534,7 +25091,6 @@
               </w:rPr>
               <w:t>Dep_id</w:t>
             </w:r>
-            <w:proofErr w:type="spellEnd"/>
           </w:p>
         </w:tc>
         <w:tc>
@@ -25682,7 +25238,6 @@
                 <w:szCs w:val="32"/>
               </w:rPr>
             </w:pPr>
-            <w:proofErr w:type="spellStart"/>
             <w:r>
               <w:rPr>
                 <w:rFonts w:ascii="TH SarabunPSK" w:hAnsi="TH SarabunPSK" w:cs="TH SarabunPSK"/>
@@ -25691,7 +25246,6 @@
               </w:rPr>
               <w:t>p_id</w:t>
             </w:r>
-            <w:proofErr w:type="spellEnd"/>
           </w:p>
         </w:tc>
         <w:tc>
@@ -25974,27 +25528,7 @@
                 <w:szCs w:val="32"/>
                 <w:cs/>
               </w:rPr>
-              <w:t>ชื่อ</w:t>
-            </w:r>
-            <w:proofErr w:type="spellStart"/>
-            <w:r>
-              <w:rPr>
-                <w:rFonts w:ascii="TH SarabunPSK" w:hAnsi="TH SarabunPSK" w:cs="TH SarabunPSK"/>
-                <w:sz w:val="32"/>
-                <w:szCs w:val="32"/>
-                <w:cs/>
-              </w:rPr>
-              <w:t>ฟิ</w:t>
-            </w:r>
-            <w:proofErr w:type="spellEnd"/>
-            <w:r>
-              <w:rPr>
-                <w:rFonts w:ascii="TH SarabunPSK" w:hAnsi="TH SarabunPSK" w:cs="TH SarabunPSK"/>
-                <w:sz w:val="32"/>
-                <w:szCs w:val="32"/>
-                <w:cs/>
-              </w:rPr>
-              <w:t>ลด์</w:t>
+              <w:t>ชื่อฟิลด์</w:t>
             </w:r>
           </w:p>
         </w:tc>
@@ -26805,25 +26339,7 @@
           <w:sz w:val="32"/>
           <w:szCs w:val="32"/>
         </w:rPr>
-        <w:t>(</w:t>
-      </w:r>
-      <w:proofErr w:type="spellStart"/>
-      <w:r>
-        <w:rPr>
-          <w:rFonts w:ascii="TH SarabunPSK" w:hAnsi="TH SarabunPSK" w:cs="TH SarabunPSK"/>
-          <w:sz w:val="32"/>
-          <w:szCs w:val="32"/>
-        </w:rPr>
-        <w:t>bhv_score</w:t>
-      </w:r>
-      <w:proofErr w:type="spellEnd"/>
-      <w:r>
-        <w:rPr>
-          <w:rFonts w:ascii="TH SarabunPSK" w:hAnsi="TH SarabunPSK" w:cs="TH SarabunPSK"/>
-          <w:sz w:val="32"/>
-          <w:szCs w:val="32"/>
-        </w:rPr>
-        <w:t>)</w:t>
+        <w:t>(bhv_score)</w:t>
       </w:r>
     </w:p>
     <w:tbl>
@@ -26869,27 +26385,7 @@
                 <w:szCs w:val="32"/>
                 <w:cs/>
               </w:rPr>
-              <w:t>ชื่อ</w:t>
-            </w:r>
-            <w:proofErr w:type="spellStart"/>
-            <w:r>
-              <w:rPr>
-                <w:rFonts w:ascii="TH SarabunPSK" w:hAnsi="TH SarabunPSK" w:cs="TH SarabunPSK"/>
-                <w:sz w:val="32"/>
-                <w:szCs w:val="32"/>
-                <w:cs/>
-              </w:rPr>
-              <w:t>ฟิ</w:t>
-            </w:r>
-            <w:proofErr w:type="spellEnd"/>
-            <w:r>
-              <w:rPr>
-                <w:rFonts w:ascii="TH SarabunPSK" w:hAnsi="TH SarabunPSK" w:cs="TH SarabunPSK"/>
-                <w:sz w:val="32"/>
-                <w:szCs w:val="32"/>
-                <w:cs/>
-              </w:rPr>
-              <w:t>ลด์</w:t>
+              <w:t>ชื่อฟิลด์</w:t>
             </w:r>
           </w:p>
         </w:tc>
@@ -27205,7 +26701,6 @@
                 <w:szCs w:val="32"/>
               </w:rPr>
             </w:pPr>
-            <w:proofErr w:type="spellStart"/>
             <w:r>
               <w:rPr>
                 <w:rFonts w:ascii="TH SarabunPSK" w:hAnsi="TH SarabunPSK" w:cs="TH SarabunPSK"/>
@@ -27214,7 +26709,6 @@
               </w:rPr>
               <w:t>user_id</w:t>
             </w:r>
-            <w:proofErr w:type="spellEnd"/>
           </w:p>
         </w:tc>
         <w:tc>
@@ -27266,7 +26760,7 @@
               </w:tabs>
               <w:jc w:val="thaiDistribute"/>
               <w:rPr>
-                <w:rFonts w:ascii="TH SarabunPSK" w:hAnsi="TH SarabunPSK" w:cs="TH SarabunPSK" w:hint="cs"/>
+                <w:rFonts w:ascii="TH SarabunPSK" w:hAnsi="TH SarabunPSK" w:cs="TH SarabunPSK"/>
                 <w:sz w:val="32"/>
                 <w:szCs w:val="32"/>
                 <w:cs/>
@@ -27511,7 +27005,6 @@
                 <w:szCs w:val="32"/>
               </w:rPr>
             </w:pPr>
-            <w:proofErr w:type="spellStart"/>
             <w:r>
               <w:rPr>
                 <w:rFonts w:ascii="TH SarabunPSK" w:hAnsi="TH SarabunPSK" w:cs="TH SarabunPSK"/>
@@ -27520,7 +27013,6 @@
               </w:rPr>
               <w:t>bhv_type</w:t>
             </w:r>
-            <w:proofErr w:type="spellEnd"/>
           </w:p>
         </w:tc>
         <w:tc>
@@ -27545,7 +27037,6 @@
                 <w:szCs w:val="32"/>
               </w:rPr>
             </w:pPr>
-            <w:proofErr w:type="spellStart"/>
             <w:r>
               <w:rPr>
                 <w:rFonts w:ascii="TH SarabunPSK" w:hAnsi="TH SarabunPSK" w:cs="TH SarabunPSK"/>
@@ -27554,7 +27045,6 @@
               </w:rPr>
               <w:t>enum</w:t>
             </w:r>
-            <w:proofErr w:type="spellEnd"/>
           </w:p>
         </w:tc>
         <w:tc>
@@ -27695,7 +27185,6 @@
                 <w:szCs w:val="32"/>
               </w:rPr>
             </w:pPr>
-            <w:proofErr w:type="spellStart"/>
             <w:r>
               <w:rPr>
                 <w:rFonts w:ascii="TH SarabunPSK" w:hAnsi="TH SarabunPSK" w:cs="TH SarabunPSK"/>
@@ -27704,7 +27193,6 @@
               </w:rPr>
               <w:t>vachar</w:t>
             </w:r>
-            <w:proofErr w:type="spellEnd"/>
           </w:p>
         </w:tc>
         <w:tc>
@@ -27724,7 +27212,7 @@
               </w:tabs>
               <w:jc w:val="thaiDistribute"/>
               <w:rPr>
-                <w:rFonts w:ascii="TH SarabunPSK" w:hAnsi="TH SarabunPSK" w:cs="TH SarabunPSK" w:hint="cs"/>
+                <w:rFonts w:ascii="TH SarabunPSK" w:hAnsi="TH SarabunPSK" w:cs="TH SarabunPSK"/>
                 <w:sz w:val="32"/>
                 <w:szCs w:val="32"/>
                 <w:cs/>
@@ -27813,7 +27301,6 @@
                 <w:szCs w:val="32"/>
               </w:rPr>
             </w:pPr>
-            <w:proofErr w:type="spellStart"/>
             <w:r>
               <w:rPr>
                 <w:rFonts w:ascii="TH SarabunPSK" w:hAnsi="TH SarabunPSK" w:cs="TH SarabunPSK"/>
@@ -27822,7 +27309,6 @@
               </w:rPr>
               <w:t>incident_date</w:t>
             </w:r>
-            <w:proofErr w:type="spellEnd"/>
           </w:p>
         </w:tc>
         <w:tc>
@@ -27874,7 +27360,7 @@
               </w:tabs>
               <w:jc w:val="thaiDistribute"/>
               <w:rPr>
-                <w:rFonts w:ascii="TH SarabunPSK" w:hAnsi="TH SarabunPSK" w:cs="TH SarabunPSK" w:hint="cs"/>
+                <w:rFonts w:ascii="TH SarabunPSK" w:hAnsi="TH SarabunPSK" w:cs="TH SarabunPSK"/>
                 <w:sz w:val="32"/>
                 <w:szCs w:val="32"/>
                 <w:cs/>
@@ -27963,7 +27449,6 @@
                 <w:szCs w:val="32"/>
               </w:rPr>
             </w:pPr>
-            <w:proofErr w:type="spellStart"/>
             <w:r>
               <w:rPr>
                 <w:rFonts w:ascii="TH SarabunPSK" w:hAnsi="TH SarabunPSK" w:cs="TH SarabunPSK"/>
@@ -27972,7 +27457,6 @@
               </w:rPr>
               <w:t>created_at</w:t>
             </w:r>
-            <w:proofErr w:type="spellEnd"/>
           </w:p>
         </w:tc>
         <w:tc>
@@ -28024,7 +27508,7 @@
               </w:tabs>
               <w:jc w:val="thaiDistribute"/>
               <w:rPr>
-                <w:rFonts w:ascii="TH SarabunPSK" w:hAnsi="TH SarabunPSK" w:cs="TH SarabunPSK" w:hint="cs"/>
+                <w:rFonts w:ascii="TH SarabunPSK" w:hAnsi="TH SarabunPSK" w:cs="TH SarabunPSK"/>
                 <w:sz w:val="32"/>
                 <w:szCs w:val="32"/>
                 <w:cs/>
@@ -28113,7 +27597,6 @@
                 <w:szCs w:val="32"/>
               </w:rPr>
             </w:pPr>
-            <w:proofErr w:type="spellStart"/>
             <w:r>
               <w:rPr>
                 <w:rFonts w:ascii="TH SarabunPSK" w:hAnsi="TH SarabunPSK" w:cs="TH SarabunPSK"/>
@@ -28122,7 +27605,6 @@
               </w:rPr>
               <w:t>recorded_by</w:t>
             </w:r>
-            <w:proofErr w:type="spellEnd"/>
           </w:p>
         </w:tc>
         <w:tc>
@@ -28174,7 +27656,7 @@
               </w:tabs>
               <w:jc w:val="thaiDistribute"/>
               <w:rPr>
-                <w:rFonts w:ascii="TH SarabunPSK" w:hAnsi="TH SarabunPSK" w:cs="TH SarabunPSK" w:hint="cs"/>
+                <w:rFonts w:ascii="TH SarabunPSK" w:hAnsi="TH SarabunPSK" w:cs="TH SarabunPSK"/>
                 <w:sz w:val="32"/>
                 <w:szCs w:val="32"/>
                 <w:cs/>
@@ -28263,7 +27745,7 @@
         <w:spacing w:after="0"/>
         <w:jc w:val="thaiDistribute"/>
         <w:rPr>
-          <w:rFonts w:ascii="TH SarabunPSK" w:hAnsi="TH SarabunPSK" w:cs="TH SarabunPSK" w:hint="cs"/>
+          <w:rFonts w:ascii="TH SarabunPSK" w:hAnsi="TH SarabunPSK" w:cs="TH SarabunPSK"/>
           <w:sz w:val="32"/>
           <w:szCs w:val="32"/>
         </w:rPr>
@@ -30109,27 +29591,7 @@
           <w:szCs w:val="32"/>
           <w:cs/>
         </w:rPr>
-        <w:t xml:space="preserve">ผู้จัดทำได้ทำการติดตั้งระบบภายในเครื่องคอมพิวเตอร์ </w:t>
-      </w:r>
-      <w:proofErr w:type="spellStart"/>
-      <w:r>
-        <w:rPr>
-          <w:rFonts w:ascii="TH SarabunPSK" w:hAnsi="TH SarabunPSK" w:cs="TH SarabunPSK"/>
-          <w:sz w:val="32"/>
-          <w:szCs w:val="32"/>
-          <w:cs/>
-        </w:rPr>
-        <w:t>โน๊ต</w:t>
-      </w:r>
-      <w:proofErr w:type="spellEnd"/>
-      <w:r>
-        <w:rPr>
-          <w:rFonts w:ascii="TH SarabunPSK" w:hAnsi="TH SarabunPSK" w:cs="TH SarabunPSK"/>
-          <w:sz w:val="32"/>
-          <w:szCs w:val="32"/>
-          <w:cs/>
-        </w:rPr>
-        <w:t>บุ๊ค</w:t>
+        <w:t>ผู้จัดทำได้ทำการติดตั้งระบบภายในเครื่องคอมพิวเตอร์ โน๊ตบุ๊ค</w:t>
       </w:r>
       <w:r>
         <w:rPr>
@@ -30579,27 +30041,7 @@
           <w:szCs w:val="32"/>
           <w:cs/>
         </w:rPr>
-        <w:t>รุงรักษาและการ</w:t>
-      </w:r>
-      <w:proofErr w:type="spellStart"/>
-      <w:r>
-        <w:rPr>
-          <w:rFonts w:ascii="TH SarabunPSK" w:hAnsi="TH SarabunPSK" w:cs="TH SarabunPSK"/>
-          <w:sz w:val="32"/>
-          <w:szCs w:val="32"/>
-          <w:cs/>
-        </w:rPr>
-        <w:t>ตรววจส</w:t>
-      </w:r>
-      <w:proofErr w:type="spellEnd"/>
-      <w:r>
-        <w:rPr>
-          <w:rFonts w:ascii="TH SarabunPSK" w:hAnsi="TH SarabunPSK" w:cs="TH SarabunPSK"/>
-          <w:sz w:val="32"/>
-          <w:szCs w:val="32"/>
-          <w:cs/>
-        </w:rPr>
-        <w:t>อบระบบโดยสม</w:t>
+        <w:t>รุงรักษาและการตรววจสอบระบบโดยสม</w:t>
       </w:r>
       <w:r>
         <w:rPr>
@@ -31225,27 +30667,7 @@
           <w:szCs w:val="32"/>
           <w:cs/>
         </w:rPr>
-        <w:t>ตามมาตราวัดของลิเค</w:t>
-      </w:r>
-      <w:proofErr w:type="spellStart"/>
-      <w:r>
-        <w:rPr>
-          <w:rFonts w:ascii="TH SarabunPSK" w:hAnsi="TH SarabunPSK" w:cs="TH SarabunPSK"/>
-          <w:sz w:val="32"/>
-          <w:szCs w:val="32"/>
-          <w:cs/>
-        </w:rPr>
-        <w:t>ิร์ท</w:t>
-      </w:r>
-      <w:proofErr w:type="spellEnd"/>
-      <w:r>
-        <w:rPr>
-          <w:rFonts w:ascii="TH SarabunPSK" w:hAnsi="TH SarabunPSK" w:cs="TH SarabunPSK"/>
-          <w:sz w:val="32"/>
-          <w:szCs w:val="32"/>
-          <w:cs/>
-        </w:rPr>
-        <w:t xml:space="preserve"> (</w:t>
+        <w:t>ตามมาตราวัดของลิเคิร์ท (</w:t>
       </w:r>
       <w:r>
         <w:rPr>
@@ -33349,27 +32771,7 @@
           <w:szCs w:val="32"/>
           <w:cs/>
         </w:rPr>
-        <w:t>ต่าง ๆ โดยใช้ในแบบสอบถามส่วนที่ 2 (</w:t>
-      </w:r>
-      <w:proofErr w:type="spellStart"/>
-      <w:r>
-        <w:rPr>
-          <w:rFonts w:ascii="TH SarabunPSK" w:eastAsiaTheme="minorEastAsia" w:hAnsi="TH SarabunPSK" w:cs="TH SarabunPSK"/>
-          <w:sz w:val="32"/>
-          <w:szCs w:val="32"/>
-          <w:cs/>
-        </w:rPr>
-        <w:t>ศิ</w:t>
-      </w:r>
-      <w:proofErr w:type="spellEnd"/>
-      <w:r>
-        <w:rPr>
-          <w:rFonts w:ascii="TH SarabunPSK" w:eastAsiaTheme="minorEastAsia" w:hAnsi="TH SarabunPSK" w:cs="TH SarabunPSK"/>
-          <w:sz w:val="32"/>
-          <w:szCs w:val="32"/>
-          <w:cs/>
-        </w:rPr>
-        <w:t>ริวัฒน์ ชนะคุณ</w:t>
+        <w:t>ต่าง ๆ โดยใช้ในแบบสอบถามส่วนที่ 2 (ศิริวัฒน์ ชนะคุณ</w:t>
       </w:r>
       <w:r>
         <w:rPr>
@@ -35330,27 +34732,7 @@
           <w:szCs w:val="32"/>
           <w:cs/>
         </w:rPr>
-        <w:t>ตามมาตราวัดของลิเค</w:t>
-      </w:r>
-      <w:proofErr w:type="spellStart"/>
-      <w:r>
-        <w:rPr>
-          <w:rFonts w:ascii="TH SarabunPSK" w:hAnsi="TH SarabunPSK" w:cs="TH SarabunPSK"/>
-          <w:sz w:val="32"/>
-          <w:szCs w:val="32"/>
-          <w:cs/>
-        </w:rPr>
-        <w:t>ิร์ท</w:t>
-      </w:r>
-      <w:proofErr w:type="spellEnd"/>
-      <w:r>
-        <w:rPr>
-          <w:rFonts w:ascii="TH SarabunPSK" w:hAnsi="TH SarabunPSK" w:cs="TH SarabunPSK"/>
-          <w:sz w:val="32"/>
-          <w:szCs w:val="32"/>
-          <w:cs/>
-        </w:rPr>
-        <w:t xml:space="preserve"> (</w:t>
+        <w:t>ตามมาตราวัดของลิเคิร์ท (</w:t>
       </w:r>
       <w:r>
         <w:rPr>
@@ -36899,27 +36281,7 @@
           <w:szCs w:val="32"/>
           <w:cs/>
         </w:rPr>
-        <w:t>เพื่อใช้แปลงความหมายของข้อมูลต่าง ๆ โดยใช้ในแบบสอบถามส่วนที่ 2 (</w:t>
-      </w:r>
-      <w:proofErr w:type="spellStart"/>
-      <w:r>
-        <w:rPr>
-          <w:rFonts w:ascii="TH SarabunPSK" w:eastAsiaTheme="minorEastAsia" w:hAnsi="TH SarabunPSK" w:cs="TH SarabunPSK"/>
-          <w:sz w:val="32"/>
-          <w:szCs w:val="32"/>
-          <w:cs/>
-        </w:rPr>
-        <w:t>ศิ</w:t>
-      </w:r>
-      <w:proofErr w:type="spellEnd"/>
-      <w:r>
-        <w:rPr>
-          <w:rFonts w:ascii="TH SarabunPSK" w:eastAsiaTheme="minorEastAsia" w:hAnsi="TH SarabunPSK" w:cs="TH SarabunPSK"/>
-          <w:sz w:val="32"/>
-          <w:szCs w:val="32"/>
-          <w:cs/>
-        </w:rPr>
-        <w:t>ริวัฒน์ ชนะคุณ</w:t>
+        <w:t>เพื่อใช้แปลงความหมายของข้อมูลต่าง ๆ โดยใช้ในแบบสอบถามส่วนที่ 2 (ศิริวัฒน์ ชนะคุณ</w:t>
       </w:r>
       <w:r>
         <w:rPr>
@@ -38167,79 +37529,20 @@
 
 <file path=word/header1.xml><?xml version="1.0" encoding="utf-8"?>
 <w:hdr xmlns:wpc="http://schemas.microsoft.com/office/word/2010/wordprocessingCanvas" xmlns:cx="http://schemas.microsoft.com/office/drawing/2014/chartex" xmlns:cx1="http://schemas.microsoft.com/office/drawing/2015/9/8/chartex" xmlns:cx2="http://schemas.microsoft.com/office/drawing/2015/10/21/chartex" xmlns:cx3="http://schemas.microsoft.com/office/drawing/2016/5/9/chartex" xmlns:cx4="http://schemas.microsoft.com/office/drawing/2016/5/10/chartex" xmlns:cx5="http://schemas.microsoft.com/office/drawing/2016/5/11/chartex" xmlns:cx6="http://schemas.microsoft.com/office/drawing/2016/5/12/chartex" xmlns:cx7="http://schemas.microsoft.com/office/drawing/2016/5/13/chartex" xmlns:cx8="http://schemas.microsoft.com/office/drawing/2016/5/14/chartex" xmlns:mc="http://schemas.openxmlformats.org/markup-compatibility/2006" xmlns:aink="http://schemas.microsoft.com/office/drawing/2016/ink" xmlns:am3d="http://schemas.microsoft.com/office/drawing/2017/model3d" xmlns:o="urn:schemas-microsoft-com:office:office" xmlns:r="http://schemas.openxmlformats.org/officeDocument/2006/relationships" xmlns:m="http://schemas.openxmlformats.org/officeDocument/2006/math" xmlns:v="urn:schemas-microsoft-com:vml" xmlns:wp14="http://schemas.microsoft.com/office/word/2010/wordprocessingDrawing" xmlns:wp="http://schemas.openxmlformats.org/drawingml/2006/wordprocessingDrawing" xmlns:w10="urn:schemas-microsoft-com:office:word" xmlns:w="http://schemas.openxmlformats.org/wordprocessingml/2006/main" xmlns:w14="http://schemas.microsoft.com/office/word/2010/wordml" xmlns:w15="http://schemas.microsoft.com/office/word/2012/wordml" xmlns:w16cex="http://schemas.microsoft.com/office/word/2018/wordml/cex" xmlns:w16cid="http://schemas.microsoft.com/office/word/2016/wordml/cid" xmlns:w16="http://schemas.microsoft.com/office/word/2018/wordml" xmlns:w16sdtdh="http://schemas.microsoft.com/office/word/2020/wordml/sdtdatahash" xmlns:w16se="http://schemas.microsoft.com/office/word/2015/wordml/symex" xmlns:wpg="http://schemas.microsoft.com/office/word/2010/wordprocessingGroup" xmlns:wpi="http://schemas.microsoft.com/office/word/2010/wordprocessingInk" xmlns:wne="http://schemas.microsoft.com/office/word/2006/wordml" xmlns:wps="http://schemas.microsoft.com/office/word/2010/wordprocessingShape" mc:Ignorable="w14 w15 w16se w16cid w16 w16cex w16sdtdh wp14">
-  <w:sdt>
-    <w:sdtPr>
+  <w:p>
+    <w:pPr>
+      <w:pStyle w:val="Header"/>
+      <w:tabs>
+        <w:tab w:val="left" w:pos="284"/>
+      </w:tabs>
+      <w:jc w:val="right"/>
       <w:rPr>
         <w:rFonts w:ascii="TH SarabunPSK" w:hAnsi="TH SarabunPSK" w:cs="TH SarabunPSK"/>
         <w:sz w:val="32"/>
         <w:szCs w:val="32"/>
       </w:rPr>
-      <w:id w:val="888071290"/>
-      <w:docPartObj>
-        <w:docPartGallery w:val="Page Numbers (Top of Page)"/>
-        <w:docPartUnique/>
-      </w:docPartObj>
-    </w:sdtPr>
-    <w:sdtEndPr/>
-    <w:sdtContent>
-      <w:p>
-        <w:pPr>
-          <w:pStyle w:val="Header"/>
-          <w:tabs>
-            <w:tab w:val="left" w:pos="284"/>
-          </w:tabs>
-          <w:jc w:val="right"/>
-          <w:rPr>
-            <w:rFonts w:ascii="TH SarabunPSK" w:hAnsi="TH SarabunPSK" w:cs="TH SarabunPSK"/>
-            <w:sz w:val="32"/>
-            <w:szCs w:val="32"/>
-          </w:rPr>
-        </w:pPr>
-        <w:r>
-          <w:rPr>
-            <w:rFonts w:ascii="TH SarabunPSK" w:hAnsi="TH SarabunPSK" w:cs="TH SarabunPSK"/>
-            <w:sz w:val="32"/>
-            <w:szCs w:val="32"/>
-          </w:rPr>
-          <w:fldChar w:fldCharType="begin"/>
-        </w:r>
-        <w:r>
-          <w:rPr>
-            <w:rFonts w:ascii="TH SarabunPSK" w:hAnsi="TH SarabunPSK" w:cs="TH SarabunPSK"/>
-            <w:sz w:val="32"/>
-            <w:szCs w:val="32"/>
-          </w:rPr>
-          <w:instrText xml:space="preserve"> PAGE   \* MERGEFORMAT </w:instrText>
-        </w:r>
-        <w:r>
-          <w:rPr>
-            <w:rFonts w:ascii="TH SarabunPSK" w:hAnsi="TH SarabunPSK" w:cs="TH SarabunPSK"/>
-            <w:sz w:val="32"/>
-            <w:szCs w:val="32"/>
-          </w:rPr>
-          <w:fldChar w:fldCharType="separate"/>
-        </w:r>
-        <w:r>
-          <w:rPr>
-            <w:rFonts w:ascii="TH SarabunPSK" w:hAnsi="TH SarabunPSK" w:cs="TH SarabunPSK"/>
-            <w:noProof/>
-            <w:sz w:val="32"/>
-            <w:szCs w:val="32"/>
-          </w:rPr>
-          <w:t>2</w:t>
-        </w:r>
-        <w:r>
-          <w:rPr>
-            <w:rFonts w:ascii="TH SarabunPSK" w:hAnsi="TH SarabunPSK" w:cs="TH SarabunPSK"/>
-            <w:noProof/>
-            <w:sz w:val="32"/>
-            <w:szCs w:val="32"/>
-          </w:rPr>
-          <w:fldChar w:fldCharType="end"/>
-        </w:r>
-      </w:p>
-    </w:sdtContent>
-  </w:sdt>
+    </w:pPr>
+  </w:p>
 </w:hdr>
 </file>
 

</xml_diff>